<commit_message>
Auto-archive: Daily PIB UPSC Brief 2026-10-14
</commit_message>
<xml_diff>
--- a/output/PIB_UPSC_Daily_2026-10-13.docx
+++ b/output/PIB_UPSC_Daily_2026-10-13.docx
@@ -53,7 +53,7 @@
                 <w:b/>
                 <w:sz w:val="20"/>
               </w:rPr>
-              <w:t>DAILY SUMMARY: Scraped 1 total PIB releases today. Found 0 high-yield articles aligned with the UPSC syllabus (None).</w:t>
+              <w:t>DAILY SUMMARY: Scraped 61 total PIB releases today. Found 21 high-yield articles aligned with the UPSC syllabus (GS-1: 3, GS-2: 5, GS-3: 13).</w:t>
             </w:r>
           </w:p>
         </w:tc>
@@ -63,6 +63,1443 @@
       <w:pPr>
         <w:spacing w:after="160"/>
       </w:pPr>
+    </w:p>
+    <w:p>
+      <w:pPr>
+        <w:spacing w:before="320" w:after="80"/>
+      </w:pPr>
+      <w:r>
+        <w:rPr>
+          <w:rFonts w:ascii="Arial" w:hAnsi="Arial"/>
+          <w:b/>
+          <w:color w:val="2563EB"/>
+          <w:sz w:val="26"/>
+        </w:rPr>
+        <w:t>■ General Studies 1: Indian Heritage, Culture, History, Society &amp; World Geography</w:t>
+      </w:r>
+    </w:p>
+    <w:p>
+      <w:pPr>
+        <w:spacing w:before="80" w:after="40"/>
+        <w:ind w:left="288"/>
+      </w:pPr>
+      <w:r>
+        <w:rPr>
+          <w:b/>
+        </w:rPr>
+        <w:t xml:space="preserve">1. </w:t>
+      </w:r>
+      <w:r>
+        <w:rPr>
+          <w:rFonts w:ascii="Calibri" w:hAnsi="Calibri"/>
+          <w:b/>
+          <w:sz w:val="23"/>
+        </w:rPr>
+        <w:t>Hindustan Aeronautics Limited (HAL), National Culture Fund (NCF) and Archaeological Survey of India (ASI) Sign MoA for Conservation and Development of Heritage Sites</w:t>
+        <w:br/>
+      </w:r>
+    </w:p>
+    <w:p>
+      <w:pPr>
+        <w:spacing w:after="40"/>
+        <w:ind w:left="576"/>
+      </w:pPr>
+      <w:r>
+        <w:rPr>
+          <w:i/>
+          <w:color w:val="64748B"/>
+          <w:sz w:val="19"/>
+        </w:rPr>
+        <w:t>Ministry: Ministry of Culture  |  Keywords: heritage</w:t>
+        <w:br/>
+      </w:r>
+      <w:r>
+        <w:rPr>
+          <w:b/>
+          <w:color w:val="1E40AF"/>
+          <w:sz w:val="20"/>
+        </w:rPr>
+        <w:t>UPSC Alignment: Aligned with General Studies 1 topics: heritage</w:t>
+        <w:br/>
+      </w:r>
+      <w:r>
+        <w:rPr>
+          <w:b/>
+          <w:color w:val="475569"/>
+          <w:sz w:val="18"/>
+        </w:rPr>
+        <w:t xml:space="preserve">Official PIB Link: </w:t>
+      </w:r>
+      <w:hyperlink r:id="rId9">
+        <w:r>
+          <w:rPr>
+            <w:color w:val="0284C7"/>
+            <w:u w:val="single"/>
+            <w:sz w:val="18"/>
+          </w:rPr>
+          <w:t>https://www.pib.gov.in/PressReleaseDetail.aspx?PRID=2322976</w:t>
+        </w:r>
+      </w:hyperlink>
+      <w:r>
+        <w:br/>
+      </w:r>
+    </w:p>
+    <w:p>
+      <w:pPr>
+        <w:spacing w:before="80" w:after="40"/>
+        <w:ind w:left="288"/>
+      </w:pPr>
+      <w:r>
+        <w:rPr>
+          <w:b/>
+        </w:rPr>
+        <w:t xml:space="preserve">2. </w:t>
+      </w:r>
+      <w:r>
+        <w:rPr>
+          <w:rFonts w:ascii="Calibri" w:hAnsi="Calibri"/>
+          <w:b/>
+          <w:sz w:val="23"/>
+        </w:rPr>
+        <w:t>Preserving Himalayas a National Responsibility; Every Citizen Has a Stake: Dr Jitendra Singh</w:t>
+        <w:br/>
+      </w:r>
+    </w:p>
+    <w:p>
+      <w:pPr>
+        <w:spacing w:after="40"/>
+        <w:ind w:left="576"/>
+      </w:pPr>
+      <w:r>
+        <w:rPr>
+          <w:i/>
+          <w:color w:val="64748B"/>
+          <w:sz w:val="19"/>
+        </w:rPr>
+        <w:t>Ministry: Ministry of Science &amp; Technology  |  Keywords: himalayas</w:t>
+        <w:br/>
+      </w:r>
+      <w:r>
+        <w:rPr>
+          <w:b/>
+          <w:color w:val="1E40AF"/>
+          <w:sz w:val="20"/>
+        </w:rPr>
+        <w:t>UPSC Alignment: Aligned with General Studies 1 topics: himalayas</w:t>
+        <w:br/>
+      </w:r>
+      <w:r>
+        <w:rPr>
+          <w:b/>
+          <w:color w:val="475569"/>
+          <w:sz w:val="18"/>
+        </w:rPr>
+        <w:t xml:space="preserve">Official PIB Link: </w:t>
+      </w:r>
+      <w:hyperlink r:id="rId10">
+        <w:r>
+          <w:rPr>
+            <w:color w:val="0284C7"/>
+            <w:u w:val="single"/>
+            <w:sz w:val="18"/>
+          </w:rPr>
+          <w:t>https://www.pib.gov.in/PressReleaseDetail.aspx?PRID=2322833</w:t>
+        </w:r>
+      </w:hyperlink>
+      <w:r>
+        <w:br/>
+      </w:r>
+    </w:p>
+    <w:p>
+      <w:pPr>
+        <w:spacing w:before="80" w:after="40"/>
+        <w:ind w:left="288"/>
+      </w:pPr>
+      <w:r>
+        <w:rPr>
+          <w:b/>
+        </w:rPr>
+        <w:t xml:space="preserve">3. </w:t>
+      </w:r>
+      <w:r>
+        <w:rPr>
+          <w:rFonts w:ascii="Calibri" w:hAnsi="Calibri"/>
+          <w:b/>
+          <w:sz w:val="23"/>
+        </w:rPr>
+        <w:t>Ministry of Tribal Affairs and Karmayogi Bharat sign MoU to bring the iGOT Karmayogi learning platform to Adi Karmayogi Volunteers</w:t>
+        <w:br/>
+      </w:r>
+    </w:p>
+    <w:p>
+      <w:pPr>
+        <w:spacing w:after="40"/>
+        <w:ind w:left="576"/>
+      </w:pPr>
+      <w:r>
+        <w:rPr>
+          <w:i/>
+          <w:color w:val="64748B"/>
+          <w:sz w:val="19"/>
+        </w:rPr>
+        <w:t>Ministry: Ministry of Tribal Affairs  |  Keywords: tribal</w:t>
+        <w:br/>
+      </w:r>
+      <w:r>
+        <w:rPr>
+          <w:b/>
+          <w:color w:val="1E40AF"/>
+          <w:sz w:val="20"/>
+        </w:rPr>
+        <w:t>UPSC Alignment: Aligned with General Studies 1 topics: tribal</w:t>
+        <w:br/>
+      </w:r>
+      <w:r>
+        <w:rPr>
+          <w:b/>
+          <w:color w:val="475569"/>
+          <w:sz w:val="18"/>
+        </w:rPr>
+        <w:t xml:space="preserve">Official PIB Link: </w:t>
+      </w:r>
+      <w:hyperlink r:id="rId11">
+        <w:r>
+          <w:rPr>
+            <w:color w:val="0284C7"/>
+            <w:u w:val="single"/>
+            <w:sz w:val="18"/>
+          </w:rPr>
+          <w:t>https://www.pib.gov.in/PressReleaseDetail.aspx?PRID=2322927</w:t>
+        </w:r>
+      </w:hyperlink>
+      <w:r>
+        <w:br/>
+      </w:r>
+    </w:p>
+    <w:p>
+      <w:pPr>
+        <w:spacing w:before="320" w:after="80"/>
+      </w:pPr>
+      <w:r>
+        <w:rPr>
+          <w:rFonts w:ascii="Arial" w:hAnsi="Arial"/>
+          <w:b/>
+          <w:color w:val="2563EB"/>
+          <w:sz w:val="26"/>
+        </w:rPr>
+        <w:t>■ General Studies 2: Governance, Constitution, Polity, Social Justice &amp; International Relations</w:t>
+      </w:r>
+    </w:p>
+    <w:p>
+      <w:pPr>
+        <w:spacing w:before="80" w:after="40"/>
+        <w:ind w:left="288"/>
+      </w:pPr>
+      <w:r>
+        <w:rPr>
+          <w:b/>
+        </w:rPr>
+        <w:t xml:space="preserve">1. </w:t>
+      </w:r>
+      <w:r>
+        <w:rPr>
+          <w:rFonts w:ascii="Calibri" w:hAnsi="Calibri"/>
+          <w:b/>
+          <w:sz w:val="23"/>
+        </w:rPr>
+        <w:t>Union Minister Shri Rajiv Ranjan Singh alias Lalan Singh Launches DBIM-Compliant DAHD Website to Strengthen Digital Governance</w:t>
+        <w:br/>
+      </w:r>
+    </w:p>
+    <w:p>
+      <w:pPr>
+        <w:spacing w:after="40"/>
+        <w:ind w:left="576"/>
+      </w:pPr>
+      <w:r>
+        <w:rPr>
+          <w:i/>
+          <w:color w:val="64748B"/>
+          <w:sz w:val="19"/>
+        </w:rPr>
+        <w:t>Ministry: Ministry of Fisheries, Animal Husbandry &amp; Dairying  |  Keywords: governance</w:t>
+        <w:br/>
+      </w:r>
+      <w:r>
+        <w:rPr>
+          <w:b/>
+          <w:color w:val="1E40AF"/>
+          <w:sz w:val="20"/>
+        </w:rPr>
+        <w:t>UPSC Alignment: Aligned with General Studies 2 topics: governance</w:t>
+        <w:br/>
+      </w:r>
+      <w:r>
+        <w:rPr>
+          <w:b/>
+          <w:color w:val="475569"/>
+          <w:sz w:val="18"/>
+        </w:rPr>
+        <w:t xml:space="preserve">Official PIB Link: </w:t>
+      </w:r>
+      <w:hyperlink r:id="rId12">
+        <w:r>
+          <w:rPr>
+            <w:color w:val="0284C7"/>
+            <w:u w:val="single"/>
+            <w:sz w:val="18"/>
+          </w:rPr>
+          <w:t>https://www.pib.gov.in/PressReleaseDetail.aspx?PRID=2322814</w:t>
+        </w:r>
+      </w:hyperlink>
+      <w:r>
+        <w:br/>
+      </w:r>
+    </w:p>
+    <w:p>
+      <w:pPr>
+        <w:spacing w:before="80" w:after="40"/>
+        <w:ind w:left="288"/>
+      </w:pPr>
+      <w:r>
+        <w:rPr>
+          <w:b/>
+        </w:rPr>
+        <w:t xml:space="preserve">2. </w:t>
+      </w:r>
+      <w:r>
+        <w:rPr>
+          <w:rFonts w:ascii="Calibri" w:hAnsi="Calibri"/>
+          <w:b/>
+          <w:sz w:val="23"/>
+        </w:rPr>
+        <w:t>Hon’ble Chairperson National Commission for Scheduled Tribes (NCST) Shri Antar Singh Arya reviewed the implementation of constitutionals safeguards and various programmes for ST’s by Ministry of Heavy Industries</w:t>
+        <w:br/>
+      </w:r>
+    </w:p>
+    <w:p>
+      <w:pPr>
+        <w:spacing w:after="40"/>
+        <w:ind w:left="576"/>
+      </w:pPr>
+      <w:r>
+        <w:rPr>
+          <w:i/>
+          <w:color w:val="64748B"/>
+          <w:sz w:val="19"/>
+        </w:rPr>
+        <w:t>Ministry: Ministry of Heavy Industries  |  Keywords: scheduled tribes</w:t>
+        <w:br/>
+      </w:r>
+      <w:r>
+        <w:rPr>
+          <w:b/>
+          <w:color w:val="1E40AF"/>
+          <w:sz w:val="20"/>
+        </w:rPr>
+        <w:t>UPSC Alignment: Aligned with General Studies 2 topics: scheduled tribes</w:t>
+        <w:br/>
+      </w:r>
+      <w:r>
+        <w:rPr>
+          <w:b/>
+          <w:color w:val="475569"/>
+          <w:sz w:val="18"/>
+        </w:rPr>
+        <w:t xml:space="preserve">Official PIB Link: </w:t>
+      </w:r>
+      <w:hyperlink r:id="rId13">
+        <w:r>
+          <w:rPr>
+            <w:color w:val="0284C7"/>
+            <w:u w:val="single"/>
+            <w:sz w:val="18"/>
+          </w:rPr>
+          <w:t>https://www.pib.gov.in/PressReleaseDetail.aspx?PRID=2322808</w:t>
+        </w:r>
+      </w:hyperlink>
+      <w:r>
+        <w:br/>
+      </w:r>
+    </w:p>
+    <w:p>
+      <w:pPr>
+        <w:spacing w:before="80" w:after="40"/>
+        <w:ind w:left="288"/>
+      </w:pPr>
+      <w:r>
+        <w:rPr>
+          <w:b/>
+        </w:rPr>
+        <w:t xml:space="preserve">3. </w:t>
+      </w:r>
+      <w:r>
+        <w:rPr>
+          <w:rFonts w:ascii="Calibri" w:hAnsi="Calibri"/>
+          <w:b/>
+          <w:sz w:val="23"/>
+        </w:rPr>
+        <w:t>President Appoints Two Judicial Officers as Additional Judges of Madras High Court</w:t>
+        <w:br/>
+      </w:r>
+    </w:p>
+    <w:p>
+      <w:pPr>
+        <w:spacing w:after="40"/>
+        <w:ind w:left="576"/>
+      </w:pPr>
+      <w:r>
+        <w:rPr>
+          <w:i/>
+          <w:color w:val="64748B"/>
+          <w:sz w:val="19"/>
+        </w:rPr>
+        <w:t>Ministry: Ministry of Law and Justice  |  Keywords: high court</w:t>
+        <w:br/>
+      </w:r>
+      <w:r>
+        <w:rPr>
+          <w:b/>
+          <w:color w:val="1E40AF"/>
+          <w:sz w:val="20"/>
+        </w:rPr>
+        <w:t>UPSC Alignment: Aligned with General Studies 2 topics: high court</w:t>
+        <w:br/>
+      </w:r>
+      <w:r>
+        <w:rPr>
+          <w:b/>
+          <w:color w:val="475569"/>
+          <w:sz w:val="18"/>
+        </w:rPr>
+        <w:t xml:space="preserve">Official PIB Link: </w:t>
+      </w:r>
+      <w:hyperlink r:id="rId14">
+        <w:r>
+          <w:rPr>
+            <w:color w:val="0284C7"/>
+            <w:u w:val="single"/>
+            <w:sz w:val="18"/>
+          </w:rPr>
+          <w:t>https://www.pib.gov.in/PressReleaseDetail.aspx?PRID=2322855</w:t>
+        </w:r>
+      </w:hyperlink>
+      <w:r>
+        <w:br/>
+      </w:r>
+    </w:p>
+    <w:p>
+      <w:pPr>
+        <w:spacing w:before="80" w:after="40"/>
+        <w:ind w:left="288"/>
+      </w:pPr>
+      <w:r>
+        <w:rPr>
+          <w:b/>
+        </w:rPr>
+        <w:t xml:space="preserve">4. </w:t>
+      </w:r>
+      <w:r>
+        <w:rPr>
+          <w:rFonts w:ascii="Calibri" w:hAnsi="Calibri"/>
+          <w:b/>
+          <w:sz w:val="23"/>
+        </w:rPr>
+        <w:t>DARPG releases the 53rd Monthly Report on Centralized Public Grievance Redress and Monitoring System (CPGRAMS) for Central Ministries/ Departments performance for the month of September, 2026</w:t>
+        <w:br/>
+      </w:r>
+    </w:p>
+    <w:p>
+      <w:pPr>
+        <w:spacing w:after="40"/>
+        <w:ind w:left="576"/>
+      </w:pPr>
+      <w:r>
+        <w:rPr>
+          <w:i/>
+          <w:color w:val="64748B"/>
+          <w:sz w:val="19"/>
+        </w:rPr>
+        <w:t>Ministry: Ministry of Personnel, Public Grievances &amp; Pensions  |  Keywords: Administrative Reforms &amp; Governance Quality</w:t>
+        <w:br/>
+      </w:r>
+      <w:r>
+        <w:rPr>
+          <w:b/>
+          <w:color w:val="1E40AF"/>
+          <w:sz w:val="20"/>
+        </w:rPr>
+        <w:t>UPSC Alignment: Strategic policy update from nodal ministry (Ministry of Personnel, Public Grievances &amp; Pensions): Administrative Reforms &amp; Governance Quality</w:t>
+        <w:br/>
+      </w:r>
+      <w:r>
+        <w:rPr>
+          <w:b/>
+          <w:color w:val="475569"/>
+          <w:sz w:val="18"/>
+        </w:rPr>
+        <w:t xml:space="preserve">Official PIB Link: </w:t>
+      </w:r>
+      <w:hyperlink r:id="rId15">
+        <w:r>
+          <w:rPr>
+            <w:color w:val="0284C7"/>
+            <w:u w:val="single"/>
+            <w:sz w:val="18"/>
+          </w:rPr>
+          <w:t>https://www.pib.gov.in/PressReleaseDetail.aspx?PRID=2322665</w:t>
+        </w:r>
+      </w:hyperlink>
+      <w:r>
+        <w:br/>
+      </w:r>
+    </w:p>
+    <w:p>
+      <w:pPr>
+        <w:spacing w:before="80" w:after="40"/>
+        <w:ind w:left="288"/>
+      </w:pPr>
+      <w:r>
+        <w:rPr>
+          <w:b/>
+        </w:rPr>
+        <w:t xml:space="preserve">5. </w:t>
+      </w:r>
+      <w:r>
+        <w:rPr>
+          <w:rFonts w:ascii="Calibri" w:hAnsi="Calibri"/>
+          <w:b/>
+          <w:sz w:val="23"/>
+        </w:rPr>
+        <w:t>DARPG releases the 50th Report on Centralized Public Grievance Redress and Monitoring System (CPGRAMS) for States/UTs for September, 2026</w:t>
+        <w:br/>
+      </w:r>
+    </w:p>
+    <w:p>
+      <w:pPr>
+        <w:spacing w:after="40"/>
+        <w:ind w:left="576"/>
+      </w:pPr>
+      <w:r>
+        <w:rPr>
+          <w:i/>
+          <w:color w:val="64748B"/>
+          <w:sz w:val="19"/>
+        </w:rPr>
+        <w:t>Ministry: Ministry of Personnel, Public Grievances &amp; Pensions  |  Keywords: Administrative Reforms &amp; Governance Quality</w:t>
+        <w:br/>
+      </w:r>
+      <w:r>
+        <w:rPr>
+          <w:b/>
+          <w:color w:val="1E40AF"/>
+          <w:sz w:val="20"/>
+        </w:rPr>
+        <w:t>UPSC Alignment: Strategic policy update from nodal ministry (Ministry of Personnel, Public Grievances &amp; Pensions): Administrative Reforms &amp; Governance Quality</w:t>
+        <w:br/>
+      </w:r>
+      <w:r>
+        <w:rPr>
+          <w:b/>
+          <w:color w:val="475569"/>
+          <w:sz w:val="18"/>
+        </w:rPr>
+        <w:t xml:space="preserve">Official PIB Link: </w:t>
+      </w:r>
+      <w:hyperlink r:id="rId16">
+        <w:r>
+          <w:rPr>
+            <w:color w:val="0284C7"/>
+            <w:u w:val="single"/>
+            <w:sz w:val="18"/>
+          </w:rPr>
+          <w:t>https://www.pib.gov.in/PressReleaseDetail.aspx?PRID=2322663</w:t>
+        </w:r>
+      </w:hyperlink>
+      <w:r>
+        <w:br/>
+      </w:r>
+    </w:p>
+    <w:p>
+      <w:pPr>
+        <w:spacing w:before="320" w:after="80"/>
+      </w:pPr>
+      <w:r>
+        <w:rPr>
+          <w:rFonts w:ascii="Arial" w:hAnsi="Arial"/>
+          <w:b/>
+          <w:color w:val="2563EB"/>
+          <w:sz w:val="26"/>
+        </w:rPr>
+        <w:t>■ General Studies 3: Economy, Agriculture, Science &amp; Tech, Environment &amp; Internal Security</w:t>
+      </w:r>
+    </w:p>
+    <w:p>
+      <w:pPr>
+        <w:spacing w:before="80" w:after="40"/>
+        <w:ind w:left="288"/>
+      </w:pPr>
+      <w:r>
+        <w:rPr>
+          <w:b/>
+        </w:rPr>
+        <w:t xml:space="preserve">1. </w:t>
+      </w:r>
+      <w:r>
+        <w:rPr>
+          <w:rFonts w:ascii="Calibri" w:hAnsi="Calibri"/>
+          <w:b/>
+          <w:sz w:val="23"/>
+        </w:rPr>
+        <w:t>Former UK Prime Minister Rishi Sunak meets Prime Minister Shri Narendra Modi at Bloomberg New Economy Forum</w:t>
+        <w:br/>
+      </w:r>
+    </w:p>
+    <w:p>
+      <w:pPr>
+        <w:spacing w:after="40"/>
+        <w:ind w:left="576"/>
+      </w:pPr>
+      <w:r>
+        <w:rPr>
+          <w:i/>
+          <w:color w:val="64748B"/>
+          <w:sz w:val="19"/>
+        </w:rPr>
+        <w:t>Ministry: Prime Minister's Office  |  Keywords: economy</w:t>
+        <w:br/>
+      </w:r>
+      <w:r>
+        <w:rPr>
+          <w:b/>
+          <w:color w:val="1E40AF"/>
+          <w:sz w:val="20"/>
+        </w:rPr>
+        <w:t>UPSC Alignment: Aligned with General Studies 3 topics: economy</w:t>
+        <w:br/>
+      </w:r>
+      <w:r>
+        <w:rPr>
+          <w:b/>
+          <w:color w:val="475569"/>
+          <w:sz w:val="18"/>
+        </w:rPr>
+        <w:t xml:space="preserve">Official PIB Link: </w:t>
+      </w:r>
+      <w:hyperlink r:id="rId17">
+        <w:r>
+          <w:rPr>
+            <w:color w:val="0284C7"/>
+            <w:u w:val="single"/>
+            <w:sz w:val="18"/>
+          </w:rPr>
+          <w:t>https://www.pib.gov.in/PressReleaseDetail.aspx?PRID=2323023</w:t>
+        </w:r>
+      </w:hyperlink>
+      <w:r>
+        <w:br/>
+      </w:r>
+    </w:p>
+    <w:p>
+      <w:pPr>
+        <w:spacing w:before="80" w:after="40"/>
+        <w:ind w:left="288"/>
+      </w:pPr>
+      <w:r>
+        <w:rPr>
+          <w:b/>
+        </w:rPr>
+        <w:t xml:space="preserve">2. </w:t>
+      </w:r>
+      <w:r>
+        <w:rPr>
+          <w:rFonts w:ascii="Calibri" w:hAnsi="Calibri"/>
+          <w:b/>
+          <w:sz w:val="23"/>
+        </w:rPr>
+        <w:t>Prime Minister Shri Narendra Modi addresses the Bloomberg New Economy Forum</w:t>
+        <w:br/>
+      </w:r>
+    </w:p>
+    <w:p>
+      <w:pPr>
+        <w:spacing w:after="40"/>
+        <w:ind w:left="576"/>
+      </w:pPr>
+      <w:r>
+        <w:rPr>
+          <w:i/>
+          <w:color w:val="64748B"/>
+          <w:sz w:val="19"/>
+        </w:rPr>
+        <w:t>Ministry: Prime Minister's Office  |  Keywords: economy</w:t>
+        <w:br/>
+      </w:r>
+      <w:r>
+        <w:rPr>
+          <w:b/>
+          <w:color w:val="1E40AF"/>
+          <w:sz w:val="20"/>
+        </w:rPr>
+        <w:t>UPSC Alignment: Aligned with General Studies 3 topics: economy</w:t>
+        <w:br/>
+      </w:r>
+      <w:r>
+        <w:rPr>
+          <w:b/>
+          <w:color w:val="475569"/>
+          <w:sz w:val="18"/>
+        </w:rPr>
+        <w:t xml:space="preserve">Official PIB Link: </w:t>
+      </w:r>
+      <w:hyperlink r:id="rId18">
+        <w:r>
+          <w:rPr>
+            <w:color w:val="0284C7"/>
+            <w:u w:val="single"/>
+            <w:sz w:val="18"/>
+          </w:rPr>
+          <w:t>https://www.pib.gov.in/PressReleaseDetail.aspx?PRID=2322664</w:t>
+        </w:r>
+      </w:hyperlink>
+      <w:r>
+        <w:br/>
+      </w:r>
+    </w:p>
+    <w:p>
+      <w:pPr>
+        <w:spacing w:before="80" w:after="40"/>
+        <w:ind w:left="288"/>
+      </w:pPr>
+      <w:r>
+        <w:rPr>
+          <w:b/>
+        </w:rPr>
+        <w:t xml:space="preserve">3. </w:t>
+      </w:r>
+      <w:r>
+        <w:rPr>
+          <w:rFonts w:ascii="Calibri" w:hAnsi="Calibri"/>
+          <w:b/>
+          <w:sz w:val="23"/>
+        </w:rPr>
+        <w:t>English rendering of PM’s address at the Bloomberg New Economy Forum in New Delhi</w:t>
+        <w:br/>
+      </w:r>
+    </w:p>
+    <w:p>
+      <w:pPr>
+        <w:spacing w:after="40"/>
+        <w:ind w:left="576"/>
+      </w:pPr>
+      <w:r>
+        <w:rPr>
+          <w:i/>
+          <w:color w:val="64748B"/>
+          <w:sz w:val="19"/>
+        </w:rPr>
+        <w:t>Ministry: Prime Minister's Office  |  Keywords: economy</w:t>
+        <w:br/>
+      </w:r>
+      <w:r>
+        <w:rPr>
+          <w:b/>
+          <w:color w:val="1E40AF"/>
+          <w:sz w:val="20"/>
+        </w:rPr>
+        <w:t>UPSC Alignment: Aligned with General Studies 3 topics: economy</w:t>
+        <w:br/>
+      </w:r>
+      <w:r>
+        <w:rPr>
+          <w:b/>
+          <w:color w:val="475569"/>
+          <w:sz w:val="18"/>
+        </w:rPr>
+        <w:t xml:space="preserve">Official PIB Link: </w:t>
+      </w:r>
+      <w:hyperlink r:id="rId19">
+        <w:r>
+          <w:rPr>
+            <w:color w:val="0284C7"/>
+            <w:u w:val="single"/>
+            <w:sz w:val="18"/>
+          </w:rPr>
+          <w:t>https://www.pib.gov.in/PressReleaseDetail.aspx?PRID=2322622</w:t>
+        </w:r>
+      </w:hyperlink>
+      <w:r>
+        <w:br/>
+      </w:r>
+    </w:p>
+    <w:p>
+      <w:pPr>
+        <w:spacing w:before="80" w:after="40"/>
+        <w:ind w:left="288"/>
+      </w:pPr>
+      <w:r>
+        <w:rPr>
+          <w:b/>
+        </w:rPr>
+        <w:t xml:space="preserve">4. </w:t>
+      </w:r>
+      <w:r>
+        <w:rPr>
+          <w:rFonts w:ascii="Calibri" w:hAnsi="Calibri"/>
+          <w:b/>
+          <w:sz w:val="23"/>
+        </w:rPr>
+        <w:t>Union Agriculture Minister Shri Shivraj Singh Chouhan and Environment Minister Shri Bhupender Yadav conduct joint review of stubble management</w:t>
+        <w:br/>
+      </w:r>
+    </w:p>
+    <w:p>
+      <w:pPr>
+        <w:spacing w:after="40"/>
+        <w:ind w:left="576"/>
+      </w:pPr>
+      <w:r>
+        <w:rPr>
+          <w:i/>
+          <w:color w:val="64748B"/>
+          <w:sz w:val="19"/>
+        </w:rPr>
+        <w:t>Ministry: Ministry of Agriculture &amp;</w:t>
+        <w:br/>
+        <w:br/>
+        <w:t>Farmers Welfare  |  Keywords: agriculture</w:t>
+        <w:br/>
+      </w:r>
+      <w:r>
+        <w:rPr>
+          <w:b/>
+          <w:color w:val="1E40AF"/>
+          <w:sz w:val="20"/>
+        </w:rPr>
+        <w:t>UPSC Alignment: Aligned with General Studies 3 topics: agriculture</w:t>
+        <w:br/>
+      </w:r>
+      <w:r>
+        <w:rPr>
+          <w:b/>
+          <w:color w:val="475569"/>
+          <w:sz w:val="18"/>
+        </w:rPr>
+        <w:t xml:space="preserve">Official PIB Link: </w:t>
+      </w:r>
+      <w:hyperlink r:id="rId20">
+        <w:r>
+          <w:rPr>
+            <w:color w:val="0284C7"/>
+            <w:u w:val="single"/>
+            <w:sz w:val="18"/>
+          </w:rPr>
+          <w:t>https://www.pib.gov.in/PressReleaseDetail.aspx?PRID=2322991</w:t>
+        </w:r>
+      </w:hyperlink>
+      <w:r>
+        <w:br/>
+      </w:r>
+    </w:p>
+    <w:p>
+      <w:pPr>
+        <w:spacing w:before="80" w:after="40"/>
+        <w:ind w:left="288"/>
+      </w:pPr>
+      <w:r>
+        <w:rPr>
+          <w:b/>
+        </w:rPr>
+        <w:t xml:space="preserve">5. </w:t>
+      </w:r>
+      <w:r>
+        <w:rPr>
+          <w:rFonts w:ascii="Calibri" w:hAnsi="Calibri"/>
+          <w:b/>
+          <w:sz w:val="23"/>
+        </w:rPr>
+        <w:t>10th National Convention of Agrivision–2026 held in New Delhi</w:t>
+        <w:br/>
+      </w:r>
+    </w:p>
+    <w:p>
+      <w:pPr>
+        <w:spacing w:after="40"/>
+        <w:ind w:left="576"/>
+      </w:pPr>
+      <w:r>
+        <w:rPr>
+          <w:i/>
+          <w:color w:val="64748B"/>
+          <w:sz w:val="19"/>
+        </w:rPr>
+        <w:t>Ministry: Ministry of Agriculture &amp;</w:t>
+        <w:br/>
+        <w:br/>
+        <w:t>Farmers Welfare  |  Keywords: agriculture</w:t>
+        <w:br/>
+      </w:r>
+      <w:r>
+        <w:rPr>
+          <w:b/>
+          <w:color w:val="1E40AF"/>
+          <w:sz w:val="20"/>
+        </w:rPr>
+        <w:t>UPSC Alignment: Aligned with General Studies 3 topics: agriculture</w:t>
+        <w:br/>
+      </w:r>
+      <w:r>
+        <w:rPr>
+          <w:b/>
+          <w:color w:val="475569"/>
+          <w:sz w:val="18"/>
+        </w:rPr>
+        <w:t xml:space="preserve">Official PIB Link: </w:t>
+      </w:r>
+      <w:hyperlink r:id="rId21">
+        <w:r>
+          <w:rPr>
+            <w:color w:val="0284C7"/>
+            <w:u w:val="single"/>
+            <w:sz w:val="18"/>
+          </w:rPr>
+          <w:t>https://www.pib.gov.in/PressReleaseDetail.aspx?PRID=2322911</w:t>
+        </w:r>
+      </w:hyperlink>
+      <w:r>
+        <w:br/>
+      </w:r>
+    </w:p>
+    <w:p>
+      <w:pPr>
+        <w:spacing w:before="80" w:after="40"/>
+        <w:ind w:left="288"/>
+      </w:pPr>
+      <w:r>
+        <w:rPr>
+          <w:b/>
+        </w:rPr>
+        <w:t xml:space="preserve">6. </w:t>
+      </w:r>
+      <w:r>
+        <w:rPr>
+          <w:rFonts w:ascii="Calibri" w:hAnsi="Calibri"/>
+          <w:b/>
+          <w:sz w:val="23"/>
+        </w:rPr>
+        <w:t>Improved Soybean Varieties NRC 268 and NRC 270 Show Promising Signs of Yielding 20 Quintals per Hectare Despite Adverse Weather Conditions</w:t>
+        <w:br/>
+      </w:r>
+    </w:p>
+    <w:p>
+      <w:pPr>
+        <w:spacing w:after="40"/>
+        <w:ind w:left="576"/>
+      </w:pPr>
+      <w:r>
+        <w:rPr>
+          <w:i/>
+          <w:color w:val="64748B"/>
+          <w:sz w:val="19"/>
+        </w:rPr>
+        <w:t>Ministry: Ministry of Agriculture &amp;</w:t>
+        <w:br/>
+        <w:br/>
+        <w:t>Farmers Welfare  |  Keywords: agriculture</w:t>
+        <w:br/>
+      </w:r>
+      <w:r>
+        <w:rPr>
+          <w:b/>
+          <w:color w:val="1E40AF"/>
+          <w:sz w:val="20"/>
+        </w:rPr>
+        <w:t>UPSC Alignment: Aligned with General Studies 3 topics: agriculture</w:t>
+        <w:br/>
+      </w:r>
+      <w:r>
+        <w:rPr>
+          <w:b/>
+          <w:color w:val="475569"/>
+          <w:sz w:val="18"/>
+        </w:rPr>
+        <w:t xml:space="preserve">Official PIB Link: </w:t>
+      </w:r>
+      <w:hyperlink r:id="rId22">
+        <w:r>
+          <w:rPr>
+            <w:color w:val="0284C7"/>
+            <w:u w:val="single"/>
+            <w:sz w:val="18"/>
+          </w:rPr>
+          <w:t>https://www.pib.gov.in/PressReleaseDetail.aspx?PRID=2322744</w:t>
+        </w:r>
+      </w:hyperlink>
+      <w:r>
+        <w:br/>
+      </w:r>
+    </w:p>
+    <w:p>
+      <w:pPr>
+        <w:spacing w:before="80" w:after="40"/>
+        <w:ind w:left="288"/>
+      </w:pPr>
+      <w:r>
+        <w:rPr>
+          <w:b/>
+        </w:rPr>
+        <w:t xml:space="preserve">7. </w:t>
+      </w:r>
+      <w:r>
+        <w:rPr>
+          <w:rFonts w:ascii="Calibri" w:hAnsi="Calibri"/>
+          <w:b/>
+          <w:sz w:val="23"/>
+        </w:rPr>
+        <w:t>PM GatiShakti National Master Plan completes five years of transforming India’s infrastructure landscape</w:t>
+        <w:br/>
+      </w:r>
+    </w:p>
+    <w:p>
+      <w:pPr>
+        <w:spacing w:after="40"/>
+        <w:ind w:left="576"/>
+      </w:pPr>
+      <w:r>
+        <w:rPr>
+          <w:i/>
+          <w:color w:val="64748B"/>
+          <w:sz w:val="19"/>
+        </w:rPr>
+        <w:t>Ministry: Ministry of Commerce &amp; Industry  |  Keywords: infrastructure</w:t>
+        <w:br/>
+      </w:r>
+      <w:r>
+        <w:rPr>
+          <w:b/>
+          <w:color w:val="1E40AF"/>
+          <w:sz w:val="20"/>
+        </w:rPr>
+        <w:t>UPSC Alignment: Aligned with General Studies 3 topics: infrastructure</w:t>
+        <w:br/>
+      </w:r>
+      <w:r>
+        <w:rPr>
+          <w:b/>
+          <w:color w:val="475569"/>
+          <w:sz w:val="18"/>
+        </w:rPr>
+        <w:t xml:space="preserve">Official PIB Link: </w:t>
+      </w:r>
+      <w:hyperlink r:id="rId23">
+        <w:r>
+          <w:rPr>
+            <w:color w:val="0284C7"/>
+            <w:u w:val="single"/>
+            <w:sz w:val="18"/>
+          </w:rPr>
+          <w:t>https://www.pib.gov.in/PressReleaseDetail.aspx?PRID=2322825</w:t>
+        </w:r>
+      </w:hyperlink>
+      <w:r>
+        <w:br/>
+      </w:r>
+    </w:p>
+    <w:p>
+      <w:pPr>
+        <w:spacing w:before="80" w:after="40"/>
+        <w:ind w:left="288"/>
+      </w:pPr>
+      <w:r>
+        <w:rPr>
+          <w:b/>
+        </w:rPr>
+        <w:t xml:space="preserve">8. </w:t>
+      </w:r>
+      <w:r>
+        <w:rPr>
+          <w:rFonts w:ascii="Calibri" w:hAnsi="Calibri"/>
+          <w:b/>
+          <w:sz w:val="23"/>
+        </w:rPr>
+        <w:t>DRDO to lead thematic session on ‘Semiconductors &amp; Next-Gen Chips’ at ESTIC-2026</w:t>
+        <w:br/>
+      </w:r>
+    </w:p>
+    <w:p>
+      <w:pPr>
+        <w:spacing w:after="40"/>
+        <w:ind w:left="576"/>
+      </w:pPr>
+      <w:r>
+        <w:rPr>
+          <w:i/>
+          <w:color w:val="64748B"/>
+          <w:sz w:val="19"/>
+        </w:rPr>
+        <w:t>Ministry: Ministry of Defence  |  Keywords: drdo</w:t>
+        <w:br/>
+      </w:r>
+      <w:r>
+        <w:rPr>
+          <w:b/>
+          <w:color w:val="1E40AF"/>
+          <w:sz w:val="20"/>
+        </w:rPr>
+        <w:t>UPSC Alignment: Aligned with General Studies 3 topics: drdo</w:t>
+        <w:br/>
+      </w:r>
+      <w:r>
+        <w:rPr>
+          <w:b/>
+          <w:color w:val="475569"/>
+          <w:sz w:val="18"/>
+        </w:rPr>
+        <w:t xml:space="preserve">Official PIB Link: </w:t>
+      </w:r>
+      <w:hyperlink r:id="rId24">
+        <w:r>
+          <w:rPr>
+            <w:color w:val="0284C7"/>
+            <w:u w:val="single"/>
+            <w:sz w:val="18"/>
+          </w:rPr>
+          <w:t>https://www.pib.gov.in/PressReleaseDetail.aspx?PRID=2322945</w:t>
+        </w:r>
+      </w:hyperlink>
+      <w:r>
+        <w:br/>
+      </w:r>
+    </w:p>
+    <w:p>
+      <w:pPr>
+        <w:spacing w:before="80" w:after="40"/>
+        <w:ind w:left="288"/>
+      </w:pPr>
+      <w:r>
+        <w:rPr>
+          <w:b/>
+        </w:rPr>
+        <w:t xml:space="preserve">9. </w:t>
+      </w:r>
+      <w:r>
+        <w:rPr>
+          <w:rFonts w:ascii="Calibri" w:hAnsi="Calibri"/>
+          <w:b/>
+          <w:sz w:val="23"/>
+        </w:rPr>
+        <w:t>INDIAN NAVY SET TO COMMISSION INDIGENOUS MULTI PURPOSE WARSHIP SAMARTHAK</w:t>
+        <w:br/>
+      </w:r>
+    </w:p>
+    <w:p>
+      <w:pPr>
+        <w:spacing w:after="40"/>
+        <w:ind w:left="576"/>
+      </w:pPr>
+      <w:r>
+        <w:rPr>
+          <w:i/>
+          <w:color w:val="64748B"/>
+          <w:sz w:val="19"/>
+        </w:rPr>
+        <w:t>Ministry: Ministry of Defence  |  Keywords: indian navy</w:t>
+        <w:br/>
+      </w:r>
+      <w:r>
+        <w:rPr>
+          <w:b/>
+          <w:color w:val="1E40AF"/>
+          <w:sz w:val="20"/>
+        </w:rPr>
+        <w:t>UPSC Alignment: Aligned with General Studies 3 topics: indian navy</w:t>
+        <w:br/>
+      </w:r>
+      <w:r>
+        <w:rPr>
+          <w:b/>
+          <w:color w:val="475569"/>
+          <w:sz w:val="18"/>
+        </w:rPr>
+        <w:t xml:space="preserve">Official PIB Link: </w:t>
+      </w:r>
+      <w:hyperlink r:id="rId25">
+        <w:r>
+          <w:rPr>
+            <w:color w:val="0284C7"/>
+            <w:u w:val="single"/>
+            <w:sz w:val="18"/>
+          </w:rPr>
+          <w:t>https://www.pib.gov.in/PressReleaseDetail.aspx?PRID=2322795</w:t>
+        </w:r>
+      </w:hyperlink>
+      <w:r>
+        <w:br/>
+      </w:r>
+    </w:p>
+    <w:p>
+      <w:pPr>
+        <w:spacing w:before="80" w:after="40"/>
+        <w:ind w:left="288"/>
+      </w:pPr>
+      <w:r>
+        <w:rPr>
+          <w:b/>
+        </w:rPr>
+        <w:t xml:space="preserve">10. </w:t>
+      </w:r>
+      <w:r>
+        <w:rPr>
+          <w:rFonts w:ascii="Calibri" w:hAnsi="Calibri"/>
+          <w:b/>
+          <w:sz w:val="23"/>
+        </w:rPr>
+        <w:t>Union Environment Minister and CM (NCT Delhi) review Air Pollution Mitigation measures at Anand Vihar Hotspot and visit DPCC’s AI-enabled ICCC facility at Shastri Park</w:t>
+        <w:br/>
+      </w:r>
+    </w:p>
+    <w:p>
+      <w:pPr>
+        <w:spacing w:after="40"/>
+        <w:ind w:left="576"/>
+      </w:pPr>
+      <w:r>
+        <w:rPr>
+          <w:i/>
+          <w:color w:val="64748B"/>
+          <w:sz w:val="19"/>
+        </w:rPr>
+        <w:t>Ministry: Ministry of Environment, Forest and Climate Change  |  Keywords: climate change</w:t>
+        <w:br/>
+      </w:r>
+      <w:r>
+        <w:rPr>
+          <w:b/>
+          <w:color w:val="1E40AF"/>
+          <w:sz w:val="20"/>
+        </w:rPr>
+        <w:t>UPSC Alignment: Aligned with General Studies 3 topics: climate change</w:t>
+        <w:br/>
+      </w:r>
+      <w:r>
+        <w:rPr>
+          <w:b/>
+          <w:color w:val="475569"/>
+          <w:sz w:val="18"/>
+        </w:rPr>
+        <w:t xml:space="preserve">Official PIB Link: </w:t>
+      </w:r>
+      <w:hyperlink r:id="rId26">
+        <w:r>
+          <w:rPr>
+            <w:color w:val="0284C7"/>
+            <w:u w:val="single"/>
+            <w:sz w:val="18"/>
+          </w:rPr>
+          <w:t>https://www.pib.gov.in/PressReleaseDetail.aspx?PRID=2322719</w:t>
+        </w:r>
+      </w:hyperlink>
+      <w:r>
+        <w:br/>
+      </w:r>
+    </w:p>
+    <w:p>
+      <w:pPr>
+        <w:spacing w:before="80" w:after="40"/>
+        <w:ind w:left="288"/>
+      </w:pPr>
+      <w:r>
+        <w:rPr>
+          <w:b/>
+        </w:rPr>
+        <w:t xml:space="preserve">11. </w:t>
+      </w:r>
+      <w:r>
+        <w:rPr>
+          <w:rFonts w:ascii="Calibri" w:hAnsi="Calibri"/>
+          <w:b/>
+          <w:sz w:val="23"/>
+        </w:rPr>
+        <w:t>Union Fisheries Secretary Dr. Abhilaksh Likhi Visits Mandapam Seaweed Cultivation Site; Interacts with Seaweed Farmers, Self-Help Groups and Scientists</w:t>
+        <w:br/>
+      </w:r>
+    </w:p>
+    <w:p>
+      <w:pPr>
+        <w:spacing w:after="40"/>
+        <w:ind w:left="576"/>
+      </w:pPr>
+      <w:r>
+        <w:rPr>
+          <w:i/>
+          <w:color w:val="64748B"/>
+          <w:sz w:val="19"/>
+        </w:rPr>
+        <w:t>Ministry: Ministry of Fisheries, Animal Husbandry &amp; Dairying  |  Keywords: animal husbandry</w:t>
+        <w:br/>
+      </w:r>
+      <w:r>
+        <w:rPr>
+          <w:b/>
+          <w:color w:val="1E40AF"/>
+          <w:sz w:val="20"/>
+        </w:rPr>
+        <w:t>UPSC Alignment: Aligned with General Studies 3 topics: animal husbandry</w:t>
+        <w:br/>
+      </w:r>
+      <w:r>
+        <w:rPr>
+          <w:b/>
+          <w:color w:val="475569"/>
+          <w:sz w:val="18"/>
+        </w:rPr>
+        <w:t xml:space="preserve">Official PIB Link: </w:t>
+      </w:r>
+      <w:hyperlink r:id="rId27">
+        <w:r>
+          <w:rPr>
+            <w:color w:val="0284C7"/>
+            <w:u w:val="single"/>
+            <w:sz w:val="18"/>
+          </w:rPr>
+          <w:t>https://www.pib.gov.in/PressReleaseDetail.aspx?PRID=2322786</w:t>
+        </w:r>
+      </w:hyperlink>
+      <w:r>
+        <w:br/>
+      </w:r>
+    </w:p>
+    <w:p>
+      <w:pPr>
+        <w:spacing w:before="80" w:after="40"/>
+        <w:ind w:left="288"/>
+      </w:pPr>
+      <w:r>
+        <w:rPr>
+          <w:b/>
+        </w:rPr>
+        <w:t xml:space="preserve">12. </w:t>
+      </w:r>
+      <w:r>
+        <w:rPr>
+          <w:rFonts w:ascii="Calibri" w:hAnsi="Calibri"/>
+          <w:b/>
+          <w:sz w:val="23"/>
+        </w:rPr>
+        <w:t>NIFTEM-K Hosts India–Canada Roundtable on Pulse Protein Innovation, Value Addition and Strategic Partnerships</w:t>
+        <w:br/>
+      </w:r>
+    </w:p>
+    <w:p>
+      <w:pPr>
+        <w:spacing w:after="40"/>
+        <w:ind w:left="576"/>
+      </w:pPr>
+      <w:r>
+        <w:rPr>
+          <w:i/>
+          <w:color w:val="64748B"/>
+          <w:sz w:val="19"/>
+        </w:rPr>
+        <w:t>Ministry: Ministry of Food Processing Industries  |  Keywords: food processing</w:t>
+        <w:br/>
+      </w:r>
+      <w:r>
+        <w:rPr>
+          <w:b/>
+          <w:color w:val="1E40AF"/>
+          <w:sz w:val="20"/>
+        </w:rPr>
+        <w:t>UPSC Alignment: Aligned with General Studies 3 topics: food processing</w:t>
+        <w:br/>
+      </w:r>
+      <w:r>
+        <w:rPr>
+          <w:b/>
+          <w:color w:val="475569"/>
+          <w:sz w:val="18"/>
+        </w:rPr>
+        <w:t xml:space="preserve">Official PIB Link: </w:t>
+      </w:r>
+      <w:hyperlink r:id="rId28">
+        <w:r>
+          <w:rPr>
+            <w:color w:val="0284C7"/>
+            <w:u w:val="single"/>
+            <w:sz w:val="18"/>
+          </w:rPr>
+          <w:t>https://www.pib.gov.in/PressReleaseDetail.aspx?PRID=2322955</w:t>
+        </w:r>
+      </w:hyperlink>
+      <w:r>
+        <w:br/>
+      </w:r>
+    </w:p>
+    <w:p>
+      <w:pPr>
+        <w:spacing w:before="80" w:after="40"/>
+        <w:ind w:left="288"/>
+      </w:pPr>
+      <w:r>
+        <w:rPr>
+          <w:b/>
+        </w:rPr>
+        <w:t xml:space="preserve">13. </w:t>
+      </w:r>
+      <w:r>
+        <w:rPr>
+          <w:rFonts w:ascii="Calibri" w:hAnsi="Calibri"/>
+          <w:b/>
+          <w:sz w:val="23"/>
+        </w:rPr>
+        <w:t>From Farms to Borders: NH-22 Four-Laning Project to Boost Connectivity and Economic Growth in Bihar</w:t>
+        <w:br/>
+      </w:r>
+    </w:p>
+    <w:p>
+      <w:pPr>
+        <w:spacing w:after="40"/>
+        <w:ind w:left="576"/>
+      </w:pPr>
+      <w:r>
+        <w:rPr>
+          <w:i/>
+          <w:color w:val="64748B"/>
+          <w:sz w:val="19"/>
+        </w:rPr>
+        <w:t>Ministry: Ministry of Road Transport &amp; Highways  |  Keywords: economic growth</w:t>
+        <w:br/>
+      </w:r>
+      <w:r>
+        <w:rPr>
+          <w:b/>
+          <w:color w:val="1E40AF"/>
+          <w:sz w:val="20"/>
+        </w:rPr>
+        <w:t>UPSC Alignment: Aligned with General Studies 3 topics: economic growth</w:t>
+        <w:br/>
+      </w:r>
+      <w:r>
+        <w:rPr>
+          <w:b/>
+          <w:color w:val="475569"/>
+          <w:sz w:val="18"/>
+        </w:rPr>
+        <w:t xml:space="preserve">Official PIB Link: </w:t>
+      </w:r>
+      <w:hyperlink r:id="rId29">
+        <w:r>
+          <w:rPr>
+            <w:color w:val="0284C7"/>
+            <w:u w:val="single"/>
+            <w:sz w:val="18"/>
+          </w:rPr>
+          <w:t>https://www.pib.gov.in/PressReleaseDetail.aspx?PRID=2322801</w:t>
+        </w:r>
+      </w:hyperlink>
+      <w:r>
+        <w:br/>
+      </w:r>
     </w:p>
     <w:sectPr>
       <w:pgSz w:w="12240" w:h="15840"/>

</xml_diff>